<commit_message>
feat: add ma très chère wife chap 03
</commit_message>
<xml_diff>
--- a/public/Books/Ma très chère épouse.docx
+++ b/public/Books/Ma très chère épouse.docx
@@ -638,13 +638,7 @@
     </w:p>
     <w:p>
       <w:r>
-        <w:t xml:space="preserve">« Si tu veux un tableau, </w:t>
-      </w:r>
-      <w:r>
-        <w:t>dis-le-moi</w:t>
-      </w:r>
-      <w:r>
-        <w:t>. »</w:t>
+        <w:t>« Si tu veux un tableau, dis-le-moi. »</w:t>
       </w:r>
     </w:p>
     <w:p>
@@ -699,6 +693,1636 @@
         <w:t>« Trois millions cinq cent mille, une fois. Trois millions cinq cent mille, deux fois. Trois millions cinq cent mille, trois fois... Félicitations, Madame Prangrawee, vous remportez ce tableau ! »</w:t>
       </w:r>
     </w:p>
+    <w:p/>
+    <w:p/>
+    <w:p/>
+    <w:p/>
+    <w:p/>
+    <w:p/>
+    <w:p/>
+    <w:p/>
+    <w:p/>
+    <w:p/>
+    <w:p/>
+    <w:p/>
+    <w:p/>
+    <w:p>
+      <w:pPr>
+        <w:rPr>
+          <w:b/>
+          <w:bCs/>
+          <w:sz w:val="40"/>
+          <w:szCs w:val="40"/>
+        </w:rPr>
+      </w:pPr>
+      <w:r>
+        <w:rPr>
+          <w:b/>
+          <w:bCs/>
+          <w:sz w:val="40"/>
+          <w:szCs w:val="40"/>
+        </w:rPr>
+        <w:lastRenderedPageBreak/>
+        <w:t xml:space="preserve">Chapitre </w:t>
+      </w:r>
+      <w:r>
+        <w:rPr>
+          <w:b/>
+          <w:bCs/>
+          <w:sz w:val="40"/>
+          <w:szCs w:val="40"/>
+        </w:rPr>
+        <w:t>0</w:t>
+      </w:r>
+      <w:r>
+        <w:rPr>
+          <w:b/>
+          <w:bCs/>
+          <w:sz w:val="40"/>
+          <w:szCs w:val="40"/>
+        </w:rPr>
+        <w:t>2</w:t>
+      </w:r>
+      <w:r>
+        <w:rPr>
+          <w:b/>
+          <w:bCs/>
+          <w:sz w:val="40"/>
+          <w:szCs w:val="40"/>
+        </w:rPr>
+        <w:t xml:space="preserve"> : </w:t>
+      </w:r>
+      <w:r>
+        <w:rPr>
+          <w:b/>
+          <w:bCs/>
+          <w:sz w:val="40"/>
+          <w:szCs w:val="40"/>
+        </w:rPr>
+        <w:t>Concurrent</w:t>
+      </w:r>
+    </w:p>
+    <w:p>
+      <w:pPr>
+        <w:rPr>
+          <w:sz w:val="40"/>
+          <w:szCs w:val="40"/>
+        </w:rPr>
+      </w:pPr>
+    </w:p>
+    <w:p>
+      <w:pPr>
+        <w:rPr>
+          <w:i/>
+          <w:iCs/>
+        </w:rPr>
+      </w:pPr>
+      <w:r>
+        <w:rPr>
+          <w:i/>
+          <w:iCs/>
+        </w:rPr>
+        <w:t>1 semaine plus tard</w:t>
+      </w:r>
+    </w:p>
+    <w:p>
+      <w:pPr>
+        <w:rPr>
+          <w:i/>
+          <w:iCs/>
+        </w:rPr>
+      </w:pPr>
+      <w:r>
+        <w:rPr>
+          <w:i/>
+          <w:iCs/>
+        </w:rPr>
+        <w:t>.</w:t>
+      </w:r>
+    </w:p>
+    <w:p>
+      <w:pPr>
+        <w:rPr>
+          <w:i/>
+          <w:iCs/>
+        </w:rPr>
+      </w:pPr>
+      <w:r>
+        <w:rPr>
+          <w:i/>
+          <w:iCs/>
+        </w:rPr>
+        <w:t>.</w:t>
+      </w:r>
+    </w:p>
+    <w:p>
+      <w:r>
+        <w:rPr>
+          <w:i/>
+          <w:iCs/>
+        </w:rPr>
+        <w:t>.</w:t>
+      </w:r>
+    </w:p>
+    <w:p>
+      <w:r>
+        <w:t xml:space="preserve">« </w:t>
+      </w:r>
+      <w:proofErr w:type="spellStart"/>
+      <w:r>
+        <w:t>Hmm</w:t>
+      </w:r>
+      <w:proofErr w:type="spellEnd"/>
+      <w:r>
+        <w:t>... Elle est bien, celle-là. Qu'est-ce que t'en penses, Lin ? »</w:t>
+      </w:r>
+    </w:p>
+    <w:p>
+      <w:r>
+        <w:t>« Un million deux... »</w:t>
+      </w:r>
+    </w:p>
+    <w:p>
+      <w:r>
+        <w:t>Le tableau que mon père avait remporté aux enchères trônait désormais dans son bureau, accroché au mur, remplaçant le vide par une œuvre d'un artiste renommé. Au moins, le million deux qu'il avait dépensé était allé à une bonne cause, et égayait la pièce. C'était bien... Les employés qui venaient discuter affaires avec lui seraient moins intimidés par son air sévère. Mais pour l'instant, je devais mettre de côté mon admiration pour cette œuvre d'art, car j'étais là pour lui faire part d'un problème.</w:t>
+      </w:r>
+    </w:p>
+    <w:p>
+      <w:r>
+        <w:t>Un dossier d'annulation de contrat était posé sur son bureau. Il l'ouvrit, son visage s'assombrit, son sourire s'effaça à mesure qu'il lisait... Nos clients étaient en train de nous être volés par une entreprise concurrente. La raison principale était qu'ils proposaient des prix plus bas que les nôtres, attirant de plus en plus de clients. J'avais envoyé quelqu'un enquêter pour savoir de quelle entreprise il s'agissait. Même si nous savions que notre commerce de matériaux de construction n'était pas un monopole, c'était la première fois qu'un concurrent nous prenait autant de clients.</w:t>
+      </w:r>
+    </w:p>
+    <w:p>
+      <w:r>
+        <w:t>« La société TR, alors ? »</w:t>
+      </w:r>
+    </w:p>
+    <w:p>
+      <w:r>
+        <w:t xml:space="preserve">« Oui. C'est une nouvelle entreprise qui essaie de voler nos clients et ceux de nombreuses autres sociétés. Et ils cherchent à se lier d'amitié avec la société MP... celle de </w:t>
+      </w:r>
+      <w:proofErr w:type="spellStart"/>
+      <w:r>
+        <w:t>Prangrawee</w:t>
+      </w:r>
+      <w:proofErr w:type="spellEnd"/>
+      <w:r>
+        <w:t>. » Je fis rapidement mon rapport sur les intentions de notre concurrent. Mon père referma le dossier noir et me fixa, le visage grave. Il tambourinait des doigts sur son bureau, réfléchissant à la situation.</w:t>
+      </w:r>
+    </w:p>
+    <w:p>
+      <w:r>
+        <w:t>Pour l'instant, ils ne parvenaient à nous prendre que des petits clients. Mais pour des hommes d'affaires comme nous, qu'il s'agisse de petits ou gros clients, un « client » reste la chose la plus importante. Nous faisons du commerce, nous avons besoin de clients pour acheter nos produits. Quiconque porte le nom de « client » mérite notre attention, qu'il achète beaucoup ou peu. Car si nous perdons nos clients, nos affaires déclinent et nous ne tirons aucun profit de ce que nous vendons.</w:t>
+      </w:r>
+    </w:p>
+    <w:p>
+      <w:r>
+        <w:lastRenderedPageBreak/>
+        <w:t xml:space="preserve">« Si le patriarche Piti était encore aux commandes, je pourrais discuter avec lui. Mais maintenant, il a passé la main à sa fille, </w:t>
+      </w:r>
+      <w:proofErr w:type="spellStart"/>
+      <w:r>
+        <w:t>Prangrawee</w:t>
+      </w:r>
+      <w:proofErr w:type="spellEnd"/>
+      <w:r>
+        <w:t>, qui dirige MP... »</w:t>
+      </w:r>
+    </w:p>
+    <w:p>
+      <w:r>
+        <w:t>« Ils pourraient changer d'avis si la société TR leur propose des prix inférieurs aux nôtres. » Et surtout, MP est un de nos plus gros clients, qui commande de grandes quantités. S'ils se tournaient vers notre concurrent... nous aurions de sérieux problèmes.</w:t>
+      </w:r>
+    </w:p>
+    <w:p>
+      <w:r>
+        <w:t>« Mais ils ont des exigences de qualité élevées. Tous leurs matériaux doivent être de premier ordre. »</w:t>
+      </w:r>
+    </w:p>
+    <w:p>
+      <w:r>
+        <w:t>« Nous ne pouvons pas nous permettre de baisser notre garde, papa. Parce que si j'étais à leur place... je choisirais probablement le fournisseur le moins cher. »</w:t>
+      </w:r>
+    </w:p>
+    <w:p>
+      <w:r>
+        <w:t>« … »</w:t>
+      </w:r>
+    </w:p>
+    <w:p>
+      <w:r>
+        <w:t>« Nous devons élaborer un plan pour reconquérir tous nos clients. »</w:t>
+      </w:r>
+    </w:p>
+    <w:p>
+      <w:r>
+        <w:t xml:space="preserve">« </w:t>
+      </w:r>
+      <w:proofErr w:type="spellStart"/>
+      <w:r>
+        <w:t>Hmm</w:t>
+      </w:r>
+      <w:proofErr w:type="spellEnd"/>
+      <w:r>
+        <w:t>. Pour MP... tu t'en occupes, Lin. Vas-y, négocie avec eux, présente-leur une nouvelle offre. Pour les autres clients, je m'en chargerai avec le conseil d'administration. »</w:t>
+      </w:r>
+    </w:p>
+    <w:p>
+      <w:r>
+        <w:t xml:space="preserve">« D'accord. » J'acquiesçai, prête à travailler en tant que vice-présidente du </w:t>
+      </w:r>
+      <w:proofErr w:type="spellStart"/>
+      <w:r>
+        <w:t>Vorakorn</w:t>
+      </w:r>
+      <w:proofErr w:type="spellEnd"/>
+      <w:r>
+        <w:t xml:space="preserve"> Group. Il semblait que j'allais devoir rencontrer </w:t>
+      </w:r>
+      <w:proofErr w:type="spellStart"/>
+      <w:r>
+        <w:t>Prangrawee</w:t>
+      </w:r>
+      <w:proofErr w:type="spellEnd"/>
+      <w:r>
+        <w:t xml:space="preserve"> en personne.</w:t>
+      </w:r>
+    </w:p>
+    <w:p>
+      <w:r>
+        <w:t>Bien que nous ayons toujours eu des représentants pour négocier les contrats, cette fois-ci, je devais faire preuve de considération envers l'autre partie, pour montrer notre sincérité et notre désir de poursuivre nos relations commerciales. Même s'ils trouvaient moins cher ailleurs, nous offrions des matériaux de qualité, conformes au prix qu'ils payaient, et j'étais prête à négocier une réduction sur certains produits, sans pour autant nous ruiner.</w:t>
+      </w:r>
+    </w:p>
+    <w:p>
+      <w:r>
+        <w:t>Mon père, qui commençait à avoir l'air plus détendu, avait certainement déjà un plan pour reconquérir les autres clients. Il ne semblait pas trop inquiet, ce qui me rassura. Restait MP, que je devais rencontrer, comme il me l'avait confié. Je me tournai et quittai son bureau. Ma secrétaire personnelle se leva et me suivit dans mon bureau personnel dès que je lui eus fait signe de la tête.</w:t>
+      </w:r>
+    </w:p>
+    <w:p>
+      <w:r>
+        <w:t xml:space="preserve">« Grace, contacte MP. Dis-leur que je souhaite rencontrer </w:t>
+      </w:r>
+      <w:proofErr w:type="spellStart"/>
+      <w:r>
+        <w:t>Prangrawee</w:t>
+      </w:r>
+      <w:proofErr w:type="spellEnd"/>
+      <w:r>
+        <w:t>. »</w:t>
+      </w:r>
+    </w:p>
+    <w:p>
+      <w:r>
+        <w:t>« Oui. » Ma jeune secrétaire acquiesça avec un sourire discret. Je m'assis, réfléchissant à l'offre à leur faire, à ce qui pourrait les inciter à rester nos partenaires commerciaux, plutôt que de signer avec notre concurrent qui s'acharnait à nous voler nos clients.</w:t>
+      </w:r>
+    </w:p>
+    <w:p>
+      <w:r>
+        <w:t xml:space="preserve">Dans le monde des affaires, rencontrer des concurrents pour le même type de produit n'a rien d'anormal. Normalement, nos prix ne s'écartent pas trop les uns des autres, car ils sont dictés par le marché. Mais ce concurrent proposait des prix bien plus bas que la plupart des entreprises. Quant à la qualité de leurs produits... j'avais des enquêteurs là-dessus. Et quant au propriétaire de la société </w:t>
+      </w:r>
+      <w:proofErr w:type="gramStart"/>
+      <w:r>
+        <w:t>TR...</w:t>
+      </w:r>
+      <w:proofErr w:type="gramEnd"/>
+      <w:r>
+        <w:t xml:space="preserve"> ça me donnait mal à la tête de penser que Ken, mon ex, s'était lancé dans ce secteur.</w:t>
+      </w:r>
+    </w:p>
+    <w:p>
+      <w:r>
+        <w:lastRenderedPageBreak/>
+        <w:t xml:space="preserve">Parfois, je lui parlais de mon travail, et il se faisait toujours l'auditeur attentionné. Quand j'étais fatiguée, j'avais besoin de me confier à quelqu'un. Mais j'étais certaine qu'il n'avait pas assez d'informations sur le </w:t>
+      </w:r>
+      <w:proofErr w:type="spellStart"/>
+      <w:r>
+        <w:t>Vorakorn</w:t>
+      </w:r>
+      <w:proofErr w:type="spellEnd"/>
+      <w:r>
+        <w:t xml:space="preserve"> Group. Même si nous étions sortis ensemble pendant deux ans, je n'avais jamais emménagé avec lui, et je n'avais jamais laissé traîner de documents importants lors de nos rendez-vous. C'était une chance que... je n'aie jamais envisagé de vivre avec Ken, à cause de la </w:t>
+      </w:r>
+      <w:proofErr w:type="spellStart"/>
+      <w:r>
+        <w:t>protectivité</w:t>
+      </w:r>
+      <w:proofErr w:type="spellEnd"/>
+      <w:r>
+        <w:t xml:space="preserve"> de mon père. Je gardais donc toujours les documents importants à la maison.</w:t>
+      </w:r>
+    </w:p>
+    <w:p>
+      <w:r>
+        <w:t xml:space="preserve">« Madame Lalin ? La secrétaire de </w:t>
+      </w:r>
+      <w:proofErr w:type="spellStart"/>
+      <w:r>
+        <w:t>Prangrawee</w:t>
+      </w:r>
+      <w:proofErr w:type="spellEnd"/>
+      <w:r>
+        <w:t xml:space="preserve"> a appelé pour dire qu'elle ne serait pas au bureau aujourd'hui. »</w:t>
+      </w:r>
+    </w:p>
+    <w:p>
+      <w:r>
+        <w:t>« Peut-on la rencontrer un autre jour ? »</w:t>
+      </w:r>
+    </w:p>
+    <w:p>
+      <w:r>
+        <w:t>« Oui, mais ils ont dit que... vous pouviez la rencontrer à son domicile. » Grace me fit son rapport. La rencontrer chez elle ?</w:t>
+      </w:r>
+    </w:p>
+    <w:p>
+      <w:r>
+        <w:t xml:space="preserve">D'après les informations que j'avais réussi à glaner sur </w:t>
+      </w:r>
+      <w:proofErr w:type="spellStart"/>
+      <w:r>
+        <w:t>Prangrawee</w:t>
+      </w:r>
+      <w:proofErr w:type="spellEnd"/>
+      <w:r>
+        <w:t xml:space="preserve">, elle n'était pas une personne facile à rencontrer. L'adresse de sa maison était difficile à trouver. Mais mon père, qui entretenait de bons rapports avec le patriarche Piti, le père de </w:t>
+      </w:r>
+      <w:proofErr w:type="spellStart"/>
+      <w:r>
+        <w:t>Prangrawee</w:t>
+      </w:r>
+      <w:proofErr w:type="spellEnd"/>
+      <w:r>
+        <w:t xml:space="preserve">, connaissait probablement sa maison. Toutefois, de ce que j'avais appris... </w:t>
+      </w:r>
+      <w:proofErr w:type="spellStart"/>
+      <w:r>
+        <w:t>Prangrawee</w:t>
+      </w:r>
+      <w:proofErr w:type="spellEnd"/>
+      <w:r>
+        <w:t xml:space="preserve"> avait quitté le domicile de son père. Alors, comment étais-je censée la rencontrer chez elle ?</w:t>
+      </w:r>
+    </w:p>
+    <w:p>
+      <w:r>
+        <w:t xml:space="preserve">« La secrétaire de </w:t>
+      </w:r>
+      <w:proofErr w:type="spellStart"/>
+      <w:r>
+        <w:t>Prangrawee</w:t>
+      </w:r>
+      <w:proofErr w:type="spellEnd"/>
+      <w:r>
+        <w:t xml:space="preserve"> m'a donné l'adresse. » Grace me tendit un petit papier dès qu'elle me vit réfléchir. Je le </w:t>
+      </w:r>
+      <w:proofErr w:type="spellStart"/>
+      <w:r>
+        <w:t>pris</w:t>
+      </w:r>
+      <w:proofErr w:type="spellEnd"/>
+      <w:r>
+        <w:t xml:space="preserve"> aussitôt. La maison de </w:t>
+      </w:r>
+      <w:proofErr w:type="spellStart"/>
+      <w:r>
+        <w:t>Prangrawee</w:t>
+      </w:r>
+      <w:proofErr w:type="spellEnd"/>
+      <w:r>
+        <w:t>... dans la même rue que la mienne ?</w:t>
+      </w:r>
+    </w:p>
+    <w:p>
+      <w:r>
+        <w:t>Je ne le savais pas. Je ne faisais généralement pas attention à mes voisins, trop prise par mon travail. Même quand j'avais un petit ami, je n'avais presque pas de temps à lui consacrer, jusqu'à ce qu'il me quitte. Grace restait là, attendant ma décision. Je tenais le papier, adossée à mon fauteuil, réfléchissant à cette femme que je n'avais rencontrée qu'une fois, lors de l'enchère de la semaine dernière... Ce fut notre première rencontre.</w:t>
+      </w:r>
+    </w:p>
+    <w:p>
+      <w:r>
+        <w:t xml:space="preserve">« Je vais aller voir </w:t>
+      </w:r>
+      <w:proofErr w:type="spellStart"/>
+      <w:r>
+        <w:t>Prangrawee</w:t>
+      </w:r>
+      <w:proofErr w:type="spellEnd"/>
+      <w:r>
+        <w:t xml:space="preserve"> tout de suite. Et je ne reviendrai pas au bureau. »</w:t>
+      </w:r>
+    </w:p>
+    <w:p>
+      <w:r>
+        <w:t>« Oui. »</w:t>
+      </w:r>
+    </w:p>
+    <w:p>
+      <w:r>
+        <w:t>.</w:t>
+      </w:r>
+    </w:p>
+    <w:p>
+      <w:r>
+        <w:t>.</w:t>
+      </w:r>
+    </w:p>
+    <w:p>
+      <w:r>
+        <w:t>La maison n'était pas grande, mais pas trop petite non plus. C'était la maison de celle que l'on surnommait la grande prêtresse de l'immobilier ? Une maison de taille moyenne, au fond de la rue. Son terrain ne semblait pas aussi vaste que les autres maisons de la rue, surtout celle de mon père, réputée pour être la plus grande. Rien qu'en tournant la tête, je pouvais voir ma propre maison au loin. Ce bloc de béton avait l'air... très petit.</w:t>
+      </w:r>
+    </w:p>
+    <w:p>
+      <w:r>
+        <w:t xml:space="preserve">« Vous pouvez entrer, Madame. </w:t>
+      </w:r>
+      <w:proofErr w:type="spellStart"/>
+      <w:r>
+        <w:t>Prangrawee</w:t>
+      </w:r>
+      <w:proofErr w:type="spellEnd"/>
+      <w:r>
+        <w:t xml:space="preserve"> est par là. »</w:t>
+      </w:r>
+    </w:p>
+    <w:p>
+      <w:r>
+        <w:lastRenderedPageBreak/>
+        <w:t>« M</w:t>
+      </w:r>
+      <w:r>
+        <w:t>…</w:t>
+      </w:r>
+      <w:r>
+        <w:t xml:space="preserve">merci. » Je souris à un bel homme, vêtu de manière décontractée, coiffé d'un large chapeau, qui me rendit un sourire amical. J'essayai de ne pas y penser, mais il avait l'air d'un jardinier. Un jardinier de la maison de </w:t>
+      </w:r>
+      <w:proofErr w:type="spellStart"/>
+      <w:r>
+        <w:t>Prangrawee</w:t>
+      </w:r>
+      <w:proofErr w:type="spellEnd"/>
+      <w:r>
+        <w:t xml:space="preserve"> avait besoin d'être aussi beau qu'un héros de série chinoise ? Sa peau était nette. Peut-être... le mari secret de cette dame ?</w:t>
+      </w:r>
+    </w:p>
+    <w:p>
+      <w:r>
+        <w:t xml:space="preserve">Mais le problème, c'était que... je ne savais pas où se trouvait </w:t>
+      </w:r>
+      <w:proofErr w:type="spellStart"/>
+      <w:r>
+        <w:t>Prangrawee</w:t>
+      </w:r>
+      <w:proofErr w:type="spellEnd"/>
+      <w:r>
+        <w:t>. Cet homme ne m'avait pas dit si elle était dans la maison ou où. Quand je me retournai pour lui demander, celui qui m'avait ouvert la porte et fait entrer... avait disparu. Je restai figée, stupéfaite, regardant autour de moi... Je ne voyais que des jardiniers en train de planter des arbres. Je ne savais pas où aller, j'étais... perdue. Sans guide, je n'osais pas m'aventurer dans une maison qui n'était pas la mienne.</w:t>
+      </w:r>
+    </w:p>
+    <w:p>
+      <w:r>
+        <w:t>« Euh... excusez-moi. » Je décidai de m'approcher d'un des jardiniers. D'après sa silhouette, c'était probablement une femme, mince, penchée sur son travail, plantant un arbre avec application. Elle leva les yeux vers moi. Son visage était dissimulé sous un chapeau de jardinier et un bandeau anti-UV.</w:t>
+      </w:r>
+    </w:p>
+    <w:p>
+      <w:r>
+        <w:t>« … »</w:t>
+      </w:r>
+    </w:p>
+    <w:p>
+      <w:r>
+        <w:t xml:space="preserve">« Savez-vous... où je pourrais trouver </w:t>
+      </w:r>
+      <w:proofErr w:type="spellStart"/>
+      <w:r>
+        <w:t>Prangrawee</w:t>
+      </w:r>
+      <w:proofErr w:type="spellEnd"/>
+      <w:r>
+        <w:t xml:space="preserve"> ? »</w:t>
+      </w:r>
+    </w:p>
+    <w:p>
+      <w:r>
+        <w:t>« … » Aucune réponse de sa part, cette femme qui... n'était pas petite du tout. Sa main gantée désigna la maison, un bâtiment mêlant béton et verre. Je suivis son indication, me demandant pourquoi cette femme m'était étrangement familière.</w:t>
+      </w:r>
+    </w:p>
+    <w:p>
+      <w:r>
+        <w:t xml:space="preserve">Cette femme mesurait bien un mètre soixante-quinze. Même avec son visage caché, on ne pouvait cacher sa peau claire et saine. De près, je pouvais voir ses yeux brun clair, qui brillaient au soleil... Cette femme, c'était elle, pas de doute. </w:t>
+      </w:r>
+      <w:proofErr w:type="spellStart"/>
+      <w:r>
+        <w:t>Prangrawee</w:t>
+      </w:r>
+      <w:proofErr w:type="spellEnd"/>
+      <w:r>
+        <w:t xml:space="preserve"> </w:t>
+      </w:r>
+      <w:proofErr w:type="spellStart"/>
+      <w:r>
+        <w:t>Pathaphiwat</w:t>
+      </w:r>
+      <w:proofErr w:type="spellEnd"/>
+      <w:r>
+        <w:t>, la grande prêtresse de l'immobilier, réputée pour être insaisissable. Et là, elle se faisait passer pour une jardinière chez elle, m'envoyant l'attendre dans sa maison, alors qu'elle se tenait juste devant moi...</w:t>
+      </w:r>
+    </w:p>
+    <w:p>
+      <w:r>
+        <w:t xml:space="preserve">« Bonjour, </w:t>
+      </w:r>
+      <w:proofErr w:type="spellStart"/>
+      <w:r>
+        <w:t>Prangrawee</w:t>
+      </w:r>
+      <w:proofErr w:type="spellEnd"/>
+      <w:r>
+        <w:t>. » Je l'accueillis avec un sourire, bien que légèrement agacée de m'être fait avoir comme ça. Mais pour l'instant, c'était moi qui sollicitais une entrevue, pour lui faire une offre intéressante afin qu'elle reste notre partenaire, et m'assurer qu'elle ne se laisserait pas séduire par notre concurrent.</w:t>
+      </w:r>
+    </w:p>
+    <w:p>
+      <w:r>
+        <w:t>« Eh bien... Bonjour, Lalin. » Elle daigna enfin parler de sa voix douce, ôtant ses gants pour les tendre au bel homme, qui s'approcha rapidement pour les prendre.</w:t>
+      </w:r>
+    </w:p>
+    <w:p>
+      <w:r>
+        <w:t>Son joli visage se révéla lorsqu'elle enleva son chapeau. Ses longs cheveux brun foncé et brillants étaient attachés en queue-de-cheval pour ne pas la gêner dans son jardinage. Son beau visage s'inclina légèrement vers moi, car j'étais... plus petite. Mais au moins, avec mon mètre soixante-dix, j'étais fière d'être assez grande, pas mal du tout comparée à elle.</w:t>
+      </w:r>
+    </w:p>
+    <w:p>
+      <w:r>
+        <w:t>« Je te les confie, Nil. »</w:t>
+      </w:r>
+    </w:p>
+    <w:p>
+      <w:r>
+        <w:lastRenderedPageBreak/>
+        <w:t>« Oui. Et Ken avec... ? »</w:t>
+      </w:r>
+    </w:p>
+    <w:p>
+      <w:r>
+        <w:t xml:space="preserve">« S'ils peuvent attendre, je les verrai après avoir parlé à Lalin. » </w:t>
+      </w:r>
+      <w:proofErr w:type="spellStart"/>
+      <w:r>
+        <w:t>Prangrawee</w:t>
+      </w:r>
+      <w:proofErr w:type="spellEnd"/>
+      <w:r>
+        <w:t xml:space="preserve"> dit d'une voix douce à cet homme qui semblait être son proche collaborateur. Il hocha la tête avant de reculer et de retourner au jardin.</w:t>
+      </w:r>
+    </w:p>
+    <w:p>
+      <w:proofErr w:type="spellStart"/>
+      <w:r>
+        <w:t>Prangrawee</w:t>
+      </w:r>
+      <w:proofErr w:type="spellEnd"/>
+      <w:r>
+        <w:t xml:space="preserve"> se tenait là, me souriant, tandis que je la regardais. Mais bientôt, son joli visage se tourna vers la porte d'entrée, là où des gens entraient, l'air contrarié. Mais son expression se changea bientôt en excitation, pas envers moi, qui restait de marbre, car je voyais qu'il s'agissait de Ken, mon ex, devenu mon concurrent, prêt à me voler mes clients.</w:t>
+      </w:r>
+    </w:p>
+    <w:p>
+      <w:r>
+        <w:t>« S'ils étaient aussi malins que vous, ils m'auraient parlé bien avant. »</w:t>
+      </w:r>
+    </w:p>
+    <w:p>
+      <w:r>
+        <w:t xml:space="preserve">« … » Je ne dis rien, mais je comprenais la situation. Ces deux-là étaient venus pour voir </w:t>
+      </w:r>
+      <w:proofErr w:type="spellStart"/>
+      <w:r>
+        <w:t>Prangrawee</w:t>
+      </w:r>
+      <w:proofErr w:type="spellEnd"/>
+      <w:r>
+        <w:t xml:space="preserve"> et lui faire une offre commerciale.</w:t>
+      </w:r>
+    </w:p>
+    <w:p>
+      <w:r>
+        <w:t xml:space="preserve">Mais cette femme, qui se tenait là, déguisée en jardinière chez elle, vêtue d'une chemise à carreaux et d'un jean blanc, le visage caché par un chapeau, si je ne l'avais pas rencontrée à l'enchère de charité, je me serais fait avoir. J'aurais été envoyée à l'intérieur pour attendre, pour finalement me retrouver face à mon ex, qui ne m'intéressait plus, et sa fiancée, qui s'avançait maintenant, un grand sourire aux lèvres, vers </w:t>
+      </w:r>
+      <w:proofErr w:type="spellStart"/>
+      <w:r>
+        <w:t>Prangrawee</w:t>
+      </w:r>
+      <w:proofErr w:type="spellEnd"/>
+      <w:r>
+        <w:t>.</w:t>
+      </w:r>
+    </w:p>
+    <w:p>
+      <w:r>
+        <w:t xml:space="preserve">« Bonjour, </w:t>
+      </w:r>
+      <w:proofErr w:type="spellStart"/>
+      <w:r>
+        <w:t>Prangrawee</w:t>
+      </w:r>
+      <w:proofErr w:type="spellEnd"/>
+      <w:r>
+        <w:t>. Nous... »</w:t>
+      </w:r>
+    </w:p>
+    <w:p>
+      <w:r>
+        <w:t>« Désolée. J'ai déjà rendez-vous avec Lalin. » Sa voix douce était celle d'une personne de bonne humeur, pas du tout contrariée d'avoir fait poireauter ces deux-là, qui avaient l'air bien agacés.</w:t>
+      </w:r>
+    </w:p>
+    <w:p>
+      <w:r>
+        <w:t>« Mais nous sommes arrivés avant... »</w:t>
+      </w:r>
+    </w:p>
+    <w:p>
+      <w:r>
+        <w:t>« … » Ken allait répliquer, mais s'arrêta net quand le sourire de ce joli visage s'effaça. Et les jardiniers... leurs regards se tournèrent vers les hommes de grande taille qui s'étaient levés, fixant Ken et sa fiancée.</w:t>
+      </w:r>
+    </w:p>
+    <w:p>
+      <w:r>
+        <w:t>« Je ne pense pas avoir à me répéter. »</w:t>
+      </w:r>
+    </w:p>
+    <w:p>
+      <w:r>
+        <w:t>« J</w:t>
+      </w:r>
+      <w:r>
+        <w:t>…</w:t>
+      </w:r>
+      <w:r>
+        <w:t>je comprends. Alors, on va y aller. »</w:t>
+      </w:r>
+    </w:p>
+    <w:p>
+      <w:r>
+        <w:t>« Nil, raccompagne-les. »</w:t>
+      </w:r>
+    </w:p>
+    <w:p>
+      <w:r>
+        <w:t>« Oui. » Dès que le bel homme eut répondu, il s'approcha et invita Ken, qui ne cessait de me jeter des regards, à quitter la maison. Je ne fis pas attention, restant immobile, laissant la maîtresse de maison gérer ses invités indésirables.</w:t>
+      </w:r>
+    </w:p>
+    <w:p>
+      <w:r>
+        <w:t xml:space="preserve">La fiancée de Ken me regarda, l'hostilité claire dans ses yeux, voyant que Ken n'arrêtait pas de me regarder. Mais je ne m'intéressais à personne d'autre qu'à ma cliente, </w:t>
+      </w:r>
+      <w:proofErr w:type="spellStart"/>
+      <w:r>
+        <w:t>Prangrawee</w:t>
+      </w:r>
+      <w:proofErr w:type="spellEnd"/>
+      <w:r>
+        <w:t xml:space="preserve">. Elle leva la main pour m'inviter à entrer. Je souris légèrement et la suivis dans cette maison de taille moyenne. Elle n'était pas petite du tout, plutôt agréable à vivre. Dans le salon, un </w:t>
+      </w:r>
+      <w:r>
+        <w:lastRenderedPageBreak/>
+        <w:t>canapé en velours marron faisait face à un grand écran de télévision avec un home cinéma. Sur le côté, un petit bar avec des étagères exposant des bouteilles de vin.</w:t>
+      </w:r>
+    </w:p>
+    <w:p>
+      <w:r>
+        <w:t xml:space="preserve">« Jus d'orange ou eau ? » demanda </w:t>
+      </w:r>
+      <w:proofErr w:type="spellStart"/>
+      <w:r>
+        <w:t>Prangrawee</w:t>
+      </w:r>
+      <w:proofErr w:type="spellEnd"/>
+      <w:r>
+        <w:t xml:space="preserve"> en se dirigeant vers le petit bar. Je réfléchis un instant.</w:t>
+      </w:r>
+    </w:p>
+    <w:p>
+      <w:r>
+        <w:t>« De l'eau, s'il vous plaît. »</w:t>
+      </w:r>
+    </w:p>
+    <w:p>
+      <w:r>
+        <w:t>« D'accord. » Elle leva les yeux pour me sourire. Ses mains blanches prirent un verre propre et une bouteille d'eau, puis elle revint vers moi. Voyant qu'elle s'installait sur le canapé, je m'assis à mon tour.</w:t>
+      </w:r>
+    </w:p>
+    <w:p>
+      <w:r>
+        <w:t xml:space="preserve">Je restai silencieuse, la regardant ouvrir la bouteille et verser de l'eau fraîche dans mon verre. Je souris en la remerciant. Elle était </w:t>
+      </w:r>
+      <w:proofErr w:type="gramStart"/>
+      <w:r>
+        <w:t>une hôte attentionnée</w:t>
+      </w:r>
+      <w:proofErr w:type="gramEnd"/>
+      <w:r>
+        <w:t>. Son corps mince s'adossa au canapé, attendant que je parle. Elle semblait savoir pourquoi j'étais venue, d'où ce silence qui me laissait la parole.</w:t>
+      </w:r>
+    </w:p>
+    <w:p>
+      <w:r>
+        <w:t xml:space="preserve">« Merci de m'avoir accordé de votre temps, </w:t>
+      </w:r>
+      <w:proofErr w:type="spellStart"/>
+      <w:r>
+        <w:t>Prangrawee</w:t>
+      </w:r>
+      <w:proofErr w:type="spellEnd"/>
+      <w:r>
+        <w:t xml:space="preserve">. Le </w:t>
+      </w:r>
+      <w:proofErr w:type="spellStart"/>
+      <w:r>
+        <w:t>Vorakorn</w:t>
+      </w:r>
+      <w:proofErr w:type="spellEnd"/>
+      <w:r>
+        <w:t xml:space="preserve"> Group souhaite vous parler d'une nouvelle offre que nous aimerions que vous examiniez. » Je lui tendis le dossier contenant la nouvelle offre avec des réductions sur certains produits.</w:t>
+      </w:r>
+    </w:p>
+    <w:p>
+      <w:r>
+        <w:t>Elle s'assit, les jambes croisées, prit le dossier et l'examina, l'air détendu. Un sourire flottait sur ses lèvres, me laissant entendre qu'elle était de bonne humeur. Son joli visage se pencha pour lire le document qui pourrait modifier le contrat entre nos deux sociétés – une entreprise de construction avec ses propres lotissements et condominiums, et celle de mon père, qui vendait tous types de matériaux.</w:t>
+      </w:r>
+    </w:p>
+    <w:p>
+      <w:r>
+        <w:t xml:space="preserve">J'attendais patiemment qu'elle termine la lecture, mais je ne pouvais m'empêcher de penser à Ken. Non pas par regret, mais parce qu'il était devenu mon concurrent. Honnêtement, je ne savais pas combien d'informations il avait sur le </w:t>
+      </w:r>
+      <w:proofErr w:type="spellStart"/>
+      <w:r>
+        <w:t>Vorakorn</w:t>
+      </w:r>
+      <w:proofErr w:type="spellEnd"/>
+      <w:r>
+        <w:t xml:space="preserve"> Group, ni si je lui avais laissé échapper des choses importantes.</w:t>
+      </w:r>
+    </w:p>
+    <w:p>
+      <w:r>
+        <w:t xml:space="preserve">« L'offre du </w:t>
+      </w:r>
+      <w:proofErr w:type="spellStart"/>
+      <w:r>
+        <w:t>Vorakorn</w:t>
+      </w:r>
+      <w:proofErr w:type="spellEnd"/>
+      <w:r>
+        <w:t xml:space="preserve"> Group est intéressante, Lalin. Mais vous savez que la société TR nous a fait une offre moins chère ? »</w:t>
+      </w:r>
+    </w:p>
+    <w:p>
+      <w:r>
+        <w:t>« Je le sais. C'est pour cela que je suis venue vous voir personnellement pour vous présenter cette offre. Bien qu'ils soient moins chers... la qualité de leurs produits pourrait être moindre, et ne pas répondre aux standards de MP. »</w:t>
+      </w:r>
+    </w:p>
+    <w:p>
+      <w:r>
+        <w:t>« C'est ce que nous sommes en train d'examiner. Demain, je réunirai le conseil d'administration pour en discuter. »</w:t>
+      </w:r>
+    </w:p>
+    <w:p>
+      <w:r>
+        <w:t xml:space="preserve">« Oui. Nous espérons que MP et le </w:t>
+      </w:r>
+      <w:proofErr w:type="spellStart"/>
+      <w:r>
+        <w:t>Vorakorn</w:t>
+      </w:r>
+      <w:proofErr w:type="spellEnd"/>
+      <w:r>
+        <w:t xml:space="preserve"> Group, qui entretiennent des liens depuis l'époque de nos grands-pères, pourront continuer à faire affaire ensemble à notre génération... »</w:t>
+      </w:r>
+    </w:p>
+    <w:p>
+      <w:r>
+        <w:t xml:space="preserve">« </w:t>
+      </w:r>
+      <w:proofErr w:type="spellStart"/>
+      <w:r>
+        <w:t>Hmm</w:t>
+      </w:r>
+      <w:proofErr w:type="spellEnd"/>
+      <w:r>
+        <w:t>... C'est vrai. »</w:t>
+      </w:r>
+    </w:p>
+    <w:p>
+      <w:r>
+        <w:lastRenderedPageBreak/>
+        <w:t>« … » Je me tus en voyant son sourire. Un sourire amical, mais empreint de ruse. Elle posa le document à côté d'elle, comme si elle ne s'y intéressait pas, préférant se concentrer sur moi.</w:t>
+      </w:r>
+    </w:p>
+    <w:p>
+      <w:r>
+        <w:t>« Votre grand-père et le mien étaient des amis proches qui ont fondé ces deux entreprises ensemble. Puis, à la génération de nos pères, ils étaient amis. Alors, à notre génération... voulez-vous que cela se résume à des liens d'intérêts commerciaux ? »</w:t>
+      </w:r>
+    </w:p>
+    <w:p>
+      <w:r>
+        <w:t xml:space="preserve">« Que voulez-vous dire, </w:t>
+      </w:r>
+      <w:proofErr w:type="spellStart"/>
+      <w:r>
+        <w:t>Prangrawee</w:t>
+      </w:r>
+      <w:proofErr w:type="spellEnd"/>
+      <w:r>
+        <w:t xml:space="preserve"> ? »</w:t>
+      </w:r>
+    </w:p>
+    <w:p>
+      <w:r>
+        <w:t>« Ce serait dommage... que ces liens entre nos deux familles se brisent parce que vos concurrents m'offrent de meilleurs bénéfices. »</w:t>
+      </w:r>
+    </w:p>
+    <w:p>
+      <w:r>
+        <w:t>« … »</w:t>
+      </w:r>
+    </w:p>
+    <w:p>
+      <w:r>
+        <w:t>« Vous savez bien, Lalin, ce qui compte le plus dans le monde des affaires. » Elle souriait toujours, bien que ses paroles me serrent le cœur à l'idée de perdre un client aussi important que MP. Mais je comprenais parfaitement ce qui primait dans les affaires.</w:t>
+      </w:r>
+    </w:p>
+    <w:p>
+      <w:r>
+        <w:t xml:space="preserve">Le profit. C'est ce que nous, hommes d'affaires, recherchons </w:t>
+      </w:r>
+      <w:proofErr w:type="gramStart"/>
+      <w:r>
+        <w:t>tous</w:t>
+      </w:r>
+      <w:proofErr w:type="gramEnd"/>
+      <w:r>
+        <w:t>. Qu'il s'agisse de petites ou grandes entreprises, le profit est la récompense que nous espérons. Si une option offre un meilleur rendement, des bénéfices plus importants, nous sommes prêts à la saisir. Comme la société TR, qui propose des matériaux de construction moins chers, MP n'hésiterait probablement pas à signer avec eux pour obtenir de meilleurs profits. À sa place... j'aurais sans doute fait la même chose. Peut-être même que j'aurais déjà signé avec TR.</w:t>
+      </w:r>
+    </w:p>
+    <w:p>
+      <w:r>
+        <w:t>« Si vous avez des demandes particulières, nous sommes prêts à les étudier. »</w:t>
+      </w:r>
+    </w:p>
+    <w:p>
+      <w:r>
+        <w:t xml:space="preserve">« Épousez-moi. En échange, MP n'achètera ses matériaux qu'au </w:t>
+      </w:r>
+      <w:proofErr w:type="spellStart"/>
+      <w:r>
+        <w:t>Vorakorn</w:t>
+      </w:r>
+      <w:proofErr w:type="spellEnd"/>
+      <w:r>
+        <w:t xml:space="preserve"> Group. »</w:t>
+      </w:r>
+    </w:p>
+    <w:p>
+      <w:r>
+        <w:t>« … Pardon ? »</w:t>
+      </w:r>
+    </w:p>
+    <w:p/>
+    <w:p/>
+    <w:p/>
+    <w:p/>
+    <w:p/>
+    <w:p/>
+    <w:p/>
+    <w:p/>
+    <w:p/>
+    <w:p/>
+    <w:p>
+      <w:pPr>
+        <w:rPr>
+          <w:b/>
+          <w:bCs/>
+          <w:sz w:val="40"/>
+          <w:szCs w:val="40"/>
+        </w:rPr>
+      </w:pPr>
+      <w:r>
+        <w:rPr>
+          <w:b/>
+          <w:bCs/>
+          <w:sz w:val="40"/>
+          <w:szCs w:val="40"/>
+        </w:rPr>
+        <w:lastRenderedPageBreak/>
+        <w:t xml:space="preserve">Chapitre </w:t>
+      </w:r>
+      <w:r>
+        <w:rPr>
+          <w:b/>
+          <w:bCs/>
+          <w:sz w:val="40"/>
+          <w:szCs w:val="40"/>
+        </w:rPr>
+        <w:t>0</w:t>
+      </w:r>
+      <w:r>
+        <w:rPr>
+          <w:b/>
+          <w:bCs/>
+          <w:sz w:val="40"/>
+          <w:szCs w:val="40"/>
+        </w:rPr>
+        <w:t>3</w:t>
+      </w:r>
+      <w:r>
+        <w:rPr>
+          <w:b/>
+          <w:bCs/>
+          <w:sz w:val="40"/>
+          <w:szCs w:val="40"/>
+        </w:rPr>
+        <w:t xml:space="preserve"> : </w:t>
+      </w:r>
+      <w:r>
+        <w:rPr>
+          <w:b/>
+          <w:bCs/>
+          <w:sz w:val="40"/>
+          <w:szCs w:val="40"/>
+        </w:rPr>
+        <w:t>À quoi penses-tu ?</w:t>
+      </w:r>
+    </w:p>
+    <w:p>
+      <w:pPr>
+        <w:rPr>
+          <w:sz w:val="40"/>
+          <w:szCs w:val="40"/>
+        </w:rPr>
+      </w:pPr>
+    </w:p>
+    <w:p>
+      <w:r>
+        <w:t xml:space="preserve">« Dites-moi, </w:t>
+      </w:r>
+      <w:proofErr w:type="spellStart"/>
+      <w:r>
+        <w:t>Prangrawee</w:t>
+      </w:r>
+      <w:proofErr w:type="spellEnd"/>
+      <w:r>
+        <w:t>... Vous ne vous moquez pas de moi, n'est-ce pas ? »</w:t>
+      </w:r>
+    </w:p>
+    <w:p>
+      <w:r>
+        <w:t>« Et vous, qu'en pensez-vous ? Croyez-vous que je plaisante ? »</w:t>
+      </w:r>
+    </w:p>
+    <w:p>
+      <w:proofErr w:type="spellStart"/>
+      <w:r>
+        <w:t>Prangrawee</w:t>
+      </w:r>
+      <w:proofErr w:type="spellEnd"/>
+      <w:r>
+        <w:t xml:space="preserve"> parlait avec désinvolture, comme si ce qu'elle venait de dire n'avait rien d'extraordinaire. Et pourtant, elle n'avait pas l'air de plaisanter. Je restai figée, stupéfaite, ne sachant pas ce qui se cachait derrière ce joli visage souriant, apparemment doux. Elle venait de me demander de l'épouser, tout à coup... À quoi pensait-elle ? Même si j'avais vu des couples se marier pour des intérêts commerciaux, je n'aurais jamais imaginé qu'on me fasse une telle proposition.</w:t>
+      </w:r>
+    </w:p>
+    <w:p>
+      <w:r>
+        <w:t xml:space="preserve">C'était une offre que je devais admettre, très intéressante. MP s'engageant à n'acheter qu'au </w:t>
+      </w:r>
+      <w:proofErr w:type="spellStart"/>
+      <w:r>
+        <w:t>Vorakorn</w:t>
+      </w:r>
+      <w:proofErr w:type="spellEnd"/>
+      <w:r>
+        <w:t xml:space="preserve"> Group, cela signifiait des bénéfices colossaux pour nous, sans parler de la stabilité financière qu'apportait leur puissance dans ce secteur. Et si, par un caprice insensé, j'acceptais d'épouser cette femme, ce lien solide empêcherait tous nos concurrents de nous voler un client aussi important que MP.</w:t>
+      </w:r>
+    </w:p>
+    <w:p>
+      <w:r>
+        <w:t xml:space="preserve">« Puis-je vous poser une question franche, </w:t>
+      </w:r>
+      <w:proofErr w:type="spellStart"/>
+      <w:r>
+        <w:t>Prangrawee</w:t>
+      </w:r>
+      <w:proofErr w:type="spellEnd"/>
+      <w:r>
+        <w:t xml:space="preserve"> ? »</w:t>
+      </w:r>
+    </w:p>
+    <w:p>
+      <w:r>
+        <w:t>« Appelez-moi simplement "Prang". C'est mon surnom... Lalin. » Elle arborait toujours son sourire en prononçant mon surnom, comme pour détendre l'atmosphère, éviter la tension. Mais ce qu'elle avait dit ne faisait qu'attiser ma perplexité.</w:t>
+      </w:r>
+    </w:p>
+    <w:p>
+      <w:r>
+        <w:t>« D'accord... Prang. Mais vous n'êtes pas en train de vous moquer de moi pour votre propre divertissement, n'est-ce pas ? »</w:t>
+      </w:r>
+    </w:p>
+    <w:p>
+      <w:r>
+        <w:t>« Cela dépend de comment vous le prenez. Je ne fais que tâter le terrain. »</w:t>
+      </w:r>
+    </w:p>
+    <w:p>
+      <w:r>
+        <w:t>« … »</w:t>
+      </w:r>
+    </w:p>
+    <w:p>
+      <w:r>
+        <w:t>« Le fait que vous soyez venue me voir aujourd'hui montre que vous ne voulez pas que l'entreprise de votre père perde un client aussi important que MP. Jusqu'où êtes-vous prête à aller pour préserver vos intérêts commerciaux</w:t>
+      </w:r>
+      <w:r>
+        <w:t>...</w:t>
+      </w:r>
+      <w:r>
+        <w:t xml:space="preserve"> </w:t>
+      </w:r>
+      <w:r>
+        <w:t>?»</w:t>
+      </w:r>
+    </w:p>
+    <w:p>
+      <w:r>
+        <w:t>« Mais le mariage n'est pas une plaisanterie. »</w:t>
+      </w:r>
+    </w:p>
+    <w:p>
+      <w:r>
+        <w:t>« C'est vrai. Mais vous savez, Lalin, si vous m'épousiez... les retombées commerciales seraient énormes. »</w:t>
+      </w:r>
+    </w:p>
+    <w:p>
+      <w:r>
+        <w:t>« … »</w:t>
+      </w:r>
+    </w:p>
+    <w:p>
+      <w:r>
+        <w:t xml:space="preserve">« Pas seulement la maison mère de MP, mais aussi nos filiales, qui utiliseraient toutes les matériaux du </w:t>
+      </w:r>
+      <w:proofErr w:type="spellStart"/>
+      <w:r>
+        <w:t>Vorakorn</w:t>
+      </w:r>
+      <w:proofErr w:type="spellEnd"/>
+      <w:r>
+        <w:t xml:space="preserve"> Group... L'intégralité de nos besoins. »</w:t>
+      </w:r>
+    </w:p>
+    <w:p>
+      <w:r>
+        <w:lastRenderedPageBreak/>
+        <w:t>« … » Je ne répondis pas, trop surprise par ce qu'elle venait de dire. Les filiales de MP étaient disséminées dans tout le pays, avec de nombreuses entreprises de construction sous leur contrôle.</w:t>
+      </w:r>
+    </w:p>
+    <w:p>
+      <w:r>
+        <w:t xml:space="preserve">Qu'il s'agisse de petits ou grands chantiers... cela signifiait que le </w:t>
+      </w:r>
+      <w:proofErr w:type="spellStart"/>
+      <w:r>
+        <w:t>Vorakorn</w:t>
+      </w:r>
+      <w:proofErr w:type="spellEnd"/>
+      <w:r>
+        <w:t xml:space="preserve"> Group détiendrait un monopole sur les ventes de matériaux à MP. Sans parler du volume d'affaires, qui augmenterait considérablement, multipliant les bénéfices. Des finances déjà solides le deviendraient encore plus. Et surtout... ce mariage renforcerait les liens entre les deux entreprises, garantissant la pérennité de leur partenariat. Mais de cette façon...</w:t>
+      </w:r>
+    </w:p>
+    <w:p>
+      <w:r>
+        <w:t>« Et vous, Prang, qu'y gagnez-vous dans ce mariage ? » Cette femme ne plaisantait certainement pas avec le mariage. Et elle ne ferait sûrement pas une offre dont elle ne tirerait aucun bénéfice.</w:t>
+      </w:r>
+    </w:p>
+    <w:p>
+      <w:r>
+        <w:t>« C'est une offre que je vous fais, Lalin. Rien de plus. »</w:t>
+      </w:r>
+    </w:p>
+    <w:p>
+      <w:r>
+        <w:t>« Prang... »</w:t>
+      </w:r>
+    </w:p>
+    <w:p>
+      <w:r>
+        <w:t>« Vous avez jusqu'à demain matin pour réfléchir. Avant que le conseil d'administration ne se réunisse pour décider si nous renouvelons ou non notre contrat avec vous. »</w:t>
+      </w:r>
+    </w:p>
+    <w:p>
+      <w:r>
+        <w:t>« … »</w:t>
+      </w:r>
+    </w:p>
+    <w:p>
+      <w:r>
+        <w:t>« Nous allons bientôt lancer un nouveau projet de condominium. Et ce ne sont pas seulement votre société ou la société TR, mais plusieurs entreprises qui sont en compétition pour que nous choisissions notre partenaire. » Comme si elle me mettait la pression pour que je me décide vite. Elle ne semblait pas du tout s'intéresser à l'offre que je lui avais présentée. Elle y jetait à peine un coup d'œil, comme si elle s'en moquait. Ce qui l'intéressait, c'était... la réponse que j'allais faire à sa propre proposition.</w:t>
+      </w:r>
+    </w:p>
+    <w:p>
+      <w:r>
+        <w:t xml:space="preserve">J'avisai difficilement. Me marier ? Et pourquoi moi, d'abord ? Et surtout... qu'est-ce qu'elle y gagnait ? Si elle pensait qu'en m'épousant, elle pourrait négocier les prix à la baisse, c'était impossible. Même mariées, le prix que j'avais proposé resterait le même. </w:t>
+      </w:r>
+      <w:proofErr w:type="spellStart"/>
+      <w:r>
+        <w:t>Prangrawee</w:t>
+      </w:r>
+      <w:proofErr w:type="spellEnd"/>
+      <w:r>
+        <w:t xml:space="preserve"> ne pourrait pas le changer. Chaque entreprise a ses propres bases de gestion, ses employés supervisés par un conseil d'administration qui fixe les prix en fonction du marché. Et </w:t>
+      </w:r>
+      <w:proofErr w:type="spellStart"/>
+      <w:r>
+        <w:t>Prangrawee</w:t>
+      </w:r>
+      <w:proofErr w:type="spellEnd"/>
+      <w:r>
+        <w:t xml:space="preserve"> ne siège pas au conseil d'administration du </w:t>
+      </w:r>
+      <w:proofErr w:type="spellStart"/>
+      <w:r>
+        <w:t>Vorakorn</w:t>
+      </w:r>
+      <w:proofErr w:type="spellEnd"/>
+      <w:r>
+        <w:t xml:space="preserve"> Group. Alors que voulait-elle vraiment de ce mariage ?</w:t>
+      </w:r>
+    </w:p>
+    <w:p>
+      <w:r>
+        <w:t>« Ou alors, si vous avez confiance en vos produits, Lalin, vous n'avez qu'à attendre notre réponse sur votre offre. » Elle prit le dossier qu'elle avait laissé de côté, mais ne fit que le regarder avec un sourire détaché, bien loin de l'état de profonde réflexion où sa proposition m'avait plongée.</w:t>
+      </w:r>
+    </w:p>
+    <w:p>
+      <w:r>
+        <w:t xml:space="preserve">J'avais confiance en mes produits. Même plus chers que chez d'autres, nos matériaux étaient de qualité et à des prix conformes au marché. Mais je commençais à douter, me demandant si le concurrent ne proposerait pas des prix encore plus bas. Et je n'avais jamais vu les </w:t>
+      </w:r>
+      <w:r>
+        <w:lastRenderedPageBreak/>
+        <w:t>produits de cette nouvelle société TR, qui nous volait un nombre non négligeable de clients. Mon père avait dû convoquer le conseil d'administration pour élaborer une stratégie de riposte.</w:t>
+      </w:r>
+    </w:p>
+    <w:p>
+      <w:r>
+        <w:t>« Je ne comprends pas... Pourquoi moi ? »</w:t>
+      </w:r>
+    </w:p>
+    <w:p>
+      <w:r>
+        <w:t>« Peut-être parce que vous êtes belle. » Mensonge. C'est ce qui m'est venu à l'esprit immédiatement. Cette femme ne ferait pas une telle proposition à une parfaite inconnue rencontrée à peine deux fois. Et je n'osais pas demander...</w:t>
+      </w:r>
+    </w:p>
+    <w:p>
+      <w:r>
+        <w:t>« Vous êtes si belle que vous avez l'embarras du choix pour vous marier. Pourtant, vous me choisissez, moi ? »</w:t>
+      </w:r>
+    </w:p>
+    <w:p>
+      <w:r>
+        <w:t>« Oui, je vous choisis, Lalin. »</w:t>
+      </w:r>
+    </w:p>
+    <w:p>
+      <w:r>
+        <w:t>« … »</w:t>
+      </w:r>
+    </w:p>
+    <w:p>
+      <w:r>
+        <w:t>« Vous êtes assez intelligente pour comprendre que ce mariage est motivé par des intérêts commerciaux. Vous y gagnez, et moi j'y trouve ce que je veux... »</w:t>
+      </w:r>
+    </w:p>
+    <w:p>
+      <w:r>
+        <w:t>« Quoi donc ? »</w:t>
+      </w:r>
+    </w:p>
+    <w:p>
+      <w:r>
+        <w:t>« ……… » Aucune réponse, juste son sourire. Mais au moins, elle admettait avoir un intérêt à me prendre pour épouse. Je n'avais pas encore découvert lequel.</w:t>
+      </w:r>
+    </w:p>
+    <w:p>
+      <w:r>
+        <w:t>Que cachait ce sourire ? C'était ce que j'essayais de percer chez elle. Mais son sourire m'empêchait d'entrer dans son esprit. Elle gardait ses émotions sous clé, ce qui la rendait presque inquiétante. C'était une redoutable femme d'affaires. Je poussai un soupir en me levant, prête à rentrer chez moi... qui se trouvait juste à côté de la sienne.</w:t>
+      </w:r>
+    </w:p>
+    <w:p>
+      <w:r>
+        <w:t xml:space="preserve">« Ce n'est pas une blague. Vous ne me laissez que très peu de temps pour réfléchir... </w:t>
+      </w:r>
+      <w:proofErr w:type="spellStart"/>
+      <w:r>
+        <w:t>Prangrawee</w:t>
+      </w:r>
+      <w:proofErr w:type="spellEnd"/>
+      <w:r>
+        <w:t>. »</w:t>
+      </w:r>
+      <w:r>
+        <w:br/>
+        <w:t>« J'attendrai votre réponse, Lalin. »</w:t>
+      </w:r>
+    </w:p>
+    <w:p>
+      <w:r>
+        <w:pict w14:anchorId="02D0DD52">
+          <v:rect id="_x0000_i1040" style="width:0;height:.75pt" o:hralign="center" o:hrstd="t" o:hr="t" fillcolor="#a0a0a0" stroked="f"/>
+        </w:pict>
+      </w:r>
+    </w:p>
+    <w:p>
+      <w:r>
+        <w:t xml:space="preserve">Je levai mon verre de whisky, réfléchissant à la proposition de </w:t>
+      </w:r>
+      <w:proofErr w:type="spellStart"/>
+      <w:r>
+        <w:t>Prangrawee</w:t>
+      </w:r>
+      <w:proofErr w:type="spellEnd"/>
+      <w:r>
+        <w:t>... Une femme complètement folle. Une femme dont je ne comprenais pas les pensées, assez audacieuse pour me faire une telle offre. Je n'arrivais pas à la cerner. Je ne savais pas si elle plaisantait pour me faire paniquer, ou si elle était sérieuse. Et pourquoi voulait-elle m'épouser, moi qui ne pouvais lui être d'aucune utilité ? Je cherchais mille raisons pour justifier ses agissements, mais je ne savais pas ce qu'elle manigançait...</w:t>
+      </w:r>
+    </w:p>
+    <w:p>
+      <w:r>
+        <w:t>« Lin, qu'est-ce qui te prend de boire seule comme ça ? » Mon père me salua en me voyant assise au bar de la maison. Je tournai la tête et le vis encore en costume de travail.</w:t>
+      </w:r>
+    </w:p>
+    <w:p>
+      <w:r>
+        <w:t>« Tu es rentré tard, papa. Et puis, as-tu dîné ? »</w:t>
+      </w:r>
+    </w:p>
+    <w:p>
+      <w:r>
+        <w:lastRenderedPageBreak/>
+        <w:t>« Oui. J'ai demandé à ma secrétaire de m'acheter un repas à emporter pendant la réunion. » Sa voix était aussi douce que son sourire. Il s'approcha de moi, posa sa main sur ma tête et la secoua gentiment, comme il aimait le faire.</w:t>
+      </w:r>
+    </w:p>
+    <w:p>
+      <w:r>
+        <w:t xml:space="preserve">Il prit un verre vide et le posa devant lui. Il s'empara de la bouteille de whisky, l'ouvrit et versa le liquide ambré dans son verre pour boire avec moi. Je poussai un soupir en repensant à la proposition de </w:t>
+      </w:r>
+      <w:proofErr w:type="spellStart"/>
+      <w:r>
+        <w:t>Prangrawee</w:t>
+      </w:r>
+      <w:proofErr w:type="spellEnd"/>
+      <w:r>
+        <w:t>. Même si nous avions de bonnes relations commerciales depuis longtemps, je ne la connaissais pas personnellement. Je ne savais pas quel genre de personne elle était. Je ne connaissais que son image publique : belle, compétente, très intelligente. Et si elle avait réussi à s'imposer dans le monde des affaires... elle ne devait pas manquer de ruse.</w:t>
+      </w:r>
+    </w:p>
+    <w:p>
+      <w:r>
+        <w:t>« Tu veux en parler ? Il y a quelque chose qui te tracasse pour que tu boives seule comme ça. » Mon père leva son verre après avoir parlé. Je ne pus m'empêcher de sourire en voyant qu'il m'avait percée à jour. C'était bien quand j'avais des soucis que je rentrais boire seule.</w:t>
+      </w:r>
+    </w:p>
+    <w:p>
+      <w:r>
+        <w:t xml:space="preserve">« Votre cliente préférée, </w:t>
+      </w:r>
+      <w:proofErr w:type="spellStart"/>
+      <w:r>
+        <w:t>Prangrawee</w:t>
+      </w:r>
+      <w:proofErr w:type="spellEnd"/>
+      <w:r>
+        <w:t>. »</w:t>
+      </w:r>
+    </w:p>
+    <w:p>
+      <w:r>
+        <w:t xml:space="preserve">« </w:t>
+      </w:r>
+      <w:proofErr w:type="spellStart"/>
+      <w:r>
+        <w:t>Hmm</w:t>
+      </w:r>
+      <w:proofErr w:type="spellEnd"/>
+      <w:r>
+        <w:t>... Tu l'as vue aujourd'hui, alors. »</w:t>
+      </w:r>
+    </w:p>
+    <w:p>
+      <w:r>
+        <w:t>« Oui. Et ça m'a fait douter de... quel genre de personne elle est. » Parce que je ne la connaissais pas. L'idée de l'épouser, une inconnue, était pour le moins étrange. Et elle me mettait la pression, ne me laissant que cette nuit pour réfléchir...</w:t>
+      </w:r>
+    </w:p>
+    <w:p>
+      <w:r>
+        <w:t>« Je ne sais pas non plus. Je ne la vois pas souvent. »</w:t>
+      </w:r>
+    </w:p>
+    <w:p>
+      <w:r>
+        <w:t>« … »</w:t>
+      </w:r>
+    </w:p>
+    <w:p>
+      <w:r>
+        <w:t xml:space="preserve">« Quand vous étiez petits, je voyais souvent le patriarche Piti parce que nos pères allaient souvent lui rendre visite. Mais après la mort de ton grand-père, on s'est éloignés. On se croise encore dans des soirées, parfois on parle affaires... On peut discuter. Mais Prang... Je ne l'ai rencontrée que quelques fois, et surtout quand elle était petite, qu'elle suivait son père aux événements. » Mon père ne put me donner de réponse. Bien que nos grands-pères aient été amis, cela ne signifiait pas que nos pères, mon père et le patriarche Piti, le père de </w:t>
+      </w:r>
+      <w:proofErr w:type="spellStart"/>
+      <w:r>
+        <w:t>Prangrawee</w:t>
+      </w:r>
+      <w:proofErr w:type="spellEnd"/>
+      <w:r>
+        <w:t>, l'étaient autant. Cela signifiait que les liens entre nos deux familles s'étaient distendus, prêts à être rompus à tout moment.</w:t>
+      </w:r>
+    </w:p>
+    <w:p>
+      <w:r>
+        <w:t xml:space="preserve">« Et pour toi, papa... quel genre de personne est </w:t>
+      </w:r>
+      <w:proofErr w:type="spellStart"/>
+      <w:r>
+        <w:t>Prangrawee</w:t>
+      </w:r>
+      <w:proofErr w:type="spellEnd"/>
+      <w:r>
+        <w:t xml:space="preserve"> ? »</w:t>
+      </w:r>
+    </w:p>
+    <w:p>
+      <w:r>
+        <w:t>« Belle, compétente, assez maligne pour tenir tête à tous ces requins des affaires qui cherchent à profiter de MP. »</w:t>
+      </w:r>
+    </w:p>
+    <w:p>
+      <w:r>
+        <w:t xml:space="preserve">« </w:t>
+      </w:r>
+      <w:proofErr w:type="spellStart"/>
+      <w:r>
+        <w:t>Hmm</w:t>
+      </w:r>
+      <w:proofErr w:type="spellEnd"/>
+      <w:r>
+        <w:t>... » Je ne trouvai rien d'autre à répondre qu'un grognement approbateur. La personnalité de cette femme restait un mystère bien gardé. Elle méritait sa réputation d'insaisissable.</w:t>
+      </w:r>
+    </w:p>
+    <w:p>
+      <w:r>
+        <w:lastRenderedPageBreak/>
+        <w:t xml:space="preserve">J'avais essayé de recueillir des informations sur elle pour l'étudier, mais en vain. </w:t>
+      </w:r>
+      <w:proofErr w:type="spellStart"/>
+      <w:r>
+        <w:t>Prangrawee</w:t>
+      </w:r>
+      <w:proofErr w:type="spellEnd"/>
+      <w:r>
+        <w:t xml:space="preserve"> fréquentait peu les soirées mondaines, mais on la voyait souvent lors d'œuvres de charité, pour lever des fonds. Elle aimait faire le bien, mais détestait les mondanités. Et ceux qui demandaient à la rencontrer en privé étaient presque toujours éconduits. Pourtant, aujourd'hui, elle m'avait reçue pour me faire une proposition pour le moins étrange, qui me laissait perplexe.</w:t>
+      </w:r>
+    </w:p>
+    <w:p>
+      <w:r>
+        <w:t>« Et pourquoi t'intéresses-tu soudainement à elle au point de me poser ces questions ? »</w:t>
+      </w:r>
+    </w:p>
+    <w:p>
+      <w:r>
+        <w:t>« Eh bien... Elle est belle, non ? »</w:t>
+      </w:r>
+    </w:p>
+    <w:p>
+      <w:r>
+        <w:t>« Belle ? »</w:t>
+      </w:r>
+    </w:p>
+    <w:p>
+      <w:r>
+        <w:t>« Oui. Tu viens de dire toi-même qu'elle est belle. »</w:t>
+      </w:r>
+    </w:p>
+    <w:p>
+      <w:r>
+        <w:t>« Hé... Ou alors elle s'intéresse à l'offre de la société de l'ex de ma fille ? »</w:t>
+      </w:r>
+    </w:p>
+    <w:p>
+      <w:r>
+        <w:t>« ……… » Je restai muette, étonnée qu'il soit déjà au courant. Mais ce n'était pas surprenant qu'il ait enquêté sur le concurrent. Il était réputé pour sa connaissance du monde des affaires, son expérience et son étude des stratégies de ses rivaux. Mais pour cela, il fallait d'abord connaître ses adversaires.</w:t>
+      </w:r>
+    </w:p>
+    <w:p>
+      <w:r>
+        <w:t>« C'est pour ça que tu es si inquiète ? Tu as quelque chose à me dire ? »</w:t>
+      </w:r>
+    </w:p>
+    <w:p>
+      <w:r>
+        <w:t>« Lin... »</w:t>
+      </w:r>
+    </w:p>
+    <w:p>
+      <w:r>
+        <w:t>« Je ne t'en veux jamais, ma fille. » Il avait un sourire tendre, pas du tout contrarié d'apprendre que la société TR, bien que récemment créée, était devenue un concurrent sérieux qui nous volait des clients. Je n'osais pas le regarder dans les yeux, alors qu'il posait sa main sur ma tête et la secouait affectueusement. De l'autre main, il portait son verre à ses lèvres, buvant pour se détendre avec moi.</w:t>
+      </w:r>
+    </w:p>
+    <w:p>
+      <w:r>
+        <w:t>« La date de création de la société TR coïncide avec la période où je sortais avec Ken. »</w:t>
+      </w:r>
+    </w:p>
+    <w:p>
+      <w:r>
+        <w:t>« Cela signifie donc... qu'il t'a utilisée pour soutirer des informations sur notre entreprise. »</w:t>
+      </w:r>
+    </w:p>
+    <w:p>
+      <w:r>
+        <w:t xml:space="preserve">« Je n'en suis pas sûre. Et je ne sais pas non plus combien d'informations importantes sur le </w:t>
+      </w:r>
+      <w:proofErr w:type="spellStart"/>
+      <w:r>
+        <w:t>Vorakorn</w:t>
+      </w:r>
+      <w:proofErr w:type="spellEnd"/>
+      <w:r>
+        <w:t xml:space="preserve"> Group j'ai pu lui révéler. » J'essayai de me rappeler ce que j'avais pu lui dire, et c'était beaucoup. Des stratégies marketing, que je n'avais pas détaillées, mais j'en avais parlé à Ken.</w:t>
+      </w:r>
+    </w:p>
+    <w:p>
+      <w:r>
+        <w:t xml:space="preserve">Les projets d'expansion de mon père, un gros contrat que j'étais sur le point de signer... Et Ken m'avait volé ce client avant même la signature. Heureusement, mon père gardait les gros clients pour lui, donc je n'avais pas eu beaucoup d'informations à lui donner. À l'époque, je faisais confiance à mon petit ami, j'avais envie de partager ce qui m'arrivait. Je n'aurais jamais imaginé qu'il utiliserait ma confiance pour devenir mon concurrent et me faire sentir coupable envers mon père. C'était peut-être de ma faute si le </w:t>
+      </w:r>
+      <w:proofErr w:type="spellStart"/>
+      <w:r>
+        <w:t>Vorakorn</w:t>
+      </w:r>
+      <w:proofErr w:type="spellEnd"/>
+      <w:r>
+        <w:t xml:space="preserve"> Group avait perdu des clients.</w:t>
+      </w:r>
+    </w:p>
+    <w:p>
+      <w:r>
+        <w:lastRenderedPageBreak/>
+        <w:t xml:space="preserve">« Je suis désolée, papa. » Ma voix était faible. Je </w:t>
+      </w:r>
+      <w:proofErr w:type="spellStart"/>
+      <w:r>
+        <w:t>serrai</w:t>
+      </w:r>
+      <w:proofErr w:type="spellEnd"/>
+      <w:r>
+        <w:t xml:space="preserve"> mon verre, rongée par la culpabilité. Je l'avais obligé à travailler tard pour élaborer une riposte face au concurrent et reconquérir nos clients.</w:t>
+      </w:r>
+    </w:p>
+    <w:p>
+      <w:r>
+        <w:t>« Ce n'est rien, ne t'en fais pas. »</w:t>
+      </w:r>
+    </w:p>
+    <w:p>
+      <w:r>
+        <w:t>« Mais à cause de moi... »</w:t>
+      </w:r>
+    </w:p>
+    <w:p>
+      <w:r>
+        <w:t>« Je t'ai dit que je ne t'en voulais pas. C'est à cet enculé qui t'a manipulée que j'en veux. »</w:t>
+      </w:r>
+    </w:p>
+    <w:p>
+      <w:r>
+        <w:t>« … »</w:t>
+      </w:r>
+    </w:p>
+    <w:p>
+      <w:r>
+        <w:t>« Je ne sais pas comment il a fait pour soutirer des informations, mais il t'a fait souffrir... Je vais couler TR. Qu'est-ce que t'en dis ? »</w:t>
+      </w:r>
+    </w:p>
+    <w:p>
+      <w:r>
+        <w:t>« Je dis que c'est une bonne idée. Mais au moins, je devrais te dire une chose. »</w:t>
+      </w:r>
+    </w:p>
+    <w:p>
+      <w:r>
+        <w:t>« Quoi donc ? »</w:t>
+      </w:r>
+    </w:p>
+    <w:p>
+      <w:r>
+        <w:t>« Comment il a soutiré ces informations. Tu es en train de penser qu'il a profité de notre intimité, c'est pour ça que tu as cette tête-là. »</w:t>
+      </w:r>
+    </w:p>
+    <w:p>
+      <w:r>
+        <w:t>« ……… » Mon père avait cet air grave, contrarié, furieux contre Ken. Je devinais ce qu'il pensait. Alors je me suis justifiée...</w:t>
+      </w:r>
+    </w:p>
+    <w:p>
+      <w:r>
+        <w:t>« Lin et Ken n'ont jamais rien fait ensemble. Je suis rentrée tous les soirs. Je ne faisais que travailler, je n'allais nulle part. J'aurais bien voulu trouver le temps d'aller me coucher avec lui ! »</w:t>
+      </w:r>
+    </w:p>
+    <w:p>
+      <w:r>
+        <w:t>« OK, ça me calme un peu. » Je le savais... Il pensait exactement à ça. Je fis une moue en voyant que mon père souriait de nouveau, plus détendu. Au moins, je pouvais parler de ça avec ma famille.</w:t>
+      </w:r>
+    </w:p>
+    <w:p>
+      <w:r>
+        <w:t>Certains peuvent être gênés d'aborder le sujet du sexe avec leurs parents, ou avec leur père, de sexe opposé, ce qui peut rendre la conversation difficile. Mais mon père avait toujours montré qu'il était prêt à accueillir tous mes problèmes. Il m'avait élevée avec attention, discutant avec moi chaque jour, et nous étions très proches. Ma mère, bien que vivant ailleurs, venait souvent me voir, pour que nos liens ne se distendent pas. Nous étions aussi proches qu'avec mon père, même si elle se plaignait souvent que je n'avais pas assez de temps pour elle à cause du travail, et qu'elle appelait mon père pour se plaindre qu'il me faisait trop travailler. Je souriais en les imaginant, eux, devenus meilleurs amis.</w:t>
+      </w:r>
+    </w:p>
+    <w:p>
+      <w:r>
+        <w:t>« Tu me prends pour une fille facile, papa ? »</w:t>
+      </w:r>
+    </w:p>
+    <w:p>
+      <w:r>
+        <w:t>« Mais non. Vous êtes sortis ensemble pendant des années, alors je me suis dit... »</w:t>
+      </w:r>
+    </w:p>
+    <w:p>
+      <w:r>
+        <w:t>« Jamais de la vie. Avec des parents aussi protecteurs, qui oserait venir me faire la cour ? »</w:t>
+      </w:r>
+    </w:p>
+    <w:p>
+      <w:r>
+        <w:t>« C'est de ta faute, tu es trop belle. »</w:t>
+      </w:r>
+    </w:p>
+    <w:p>
+      <w:r>
+        <w:lastRenderedPageBreak/>
+        <w:t>« Entre Lin et Prang... »</w:t>
+      </w:r>
+    </w:p>
+    <w:p>
+      <w:r>
+        <w:t>« Je ne sais pas ce que les autres en pensent, mais à mes yeux... Lin est la plus belle. » Un large sourire éclaira son visage alors qu'il complimentait sa fille. L'atmosphère s'était détendue, et nous bavardions en buvant ce bon whisky.</w:t>
+      </w:r>
+    </w:p>
+    <w:p>
+      <w:r>
+        <w:t>« Tu en veux encore ? Si tu es trop fatiguée demain, tu peux rester à la maison. »</w:t>
+      </w:r>
+    </w:p>
+    <w:p>
+      <w:r>
+        <w:t>« J'ai une réunion demain, je ne peux pas me permettre de m'absenter. » Je répondis en souriant, l'esprit un peu plus léger. Mais je n'avais pas oublié mes soucis pour autant.</w:t>
+      </w:r>
+    </w:p>
+    <w:p>
+      <w:r>
+        <w:t xml:space="preserve">Mon père me resservit un verre. Nous commençâmes à parler du travail, ou de tout et de rien, comme nous le faisions toujours. Mais dans ma tête, je pensais à la proposition de </w:t>
+      </w:r>
+      <w:proofErr w:type="spellStart"/>
+      <w:r>
+        <w:t>Prangrawee</w:t>
+      </w:r>
+      <w:proofErr w:type="spellEnd"/>
+      <w:r>
+        <w:t>. Je regardai mon père, le cœur serré de l'avoir mis dans cette situation. Il n'avait pas l'air tendu, même si un concurrent lui volait des clients. Peut-être parce qu'il y avait toujours de la concurrence dans ce secteur, que ce genre de choses arrivait souvent. Mais cette fois-ci, le concurrent était l'ex-petit ami de sa fille, qui avait utilisé les informations qu'elle lui avait confiées.</w:t>
+      </w:r>
+    </w:p>
+    <w:p>
+      <w:r>
+        <w:t xml:space="preserve">Si épouser Prangrawee pouvait lui éviter de rentrer si tard, de perdre un client important... j'étais prête à le faire. Si j'acceptais d'épouser </w:t>
+      </w:r>
+      <w:proofErr w:type="spellStart"/>
+      <w:r>
+        <w:t>Prangrawee</w:t>
+      </w:r>
+      <w:proofErr w:type="spellEnd"/>
+      <w:r>
+        <w:t>, les bénéfices seraient considérables. Ce ne serait pas un mariage d'amour, mais je commençais à voir plus d'avantages que d'inconvénients. Et surtout... si un jour nous divorcions, nous étions deux femmes, sans héritiers, donc aucun lien ne nous retiendrait.</w:t>
+      </w:r>
+    </w:p>
+    <w:p>
+      <w:r>
+        <w:t>« Ah, ta mère a encore appelé pour se plaindre que je te fais trop travailler. »</w:t>
+      </w:r>
+    </w:p>
+    <w:p>
+      <w:r>
+        <w:t>« Tu devrais t'y habituer, papa. »</w:t>
+      </w:r>
+    </w:p>
+    <w:p/>
+    <w:p/>
+    <w:p/>
+    <w:p/>
+    <w:p/>
+    <w:p/>
+    <w:p/>
+    <w:p/>
+    <w:p/>
+    <w:p/>
+    <w:p/>
     <w:p/>
     <w:sectPr>
       <w:pgSz w:w="11906" w:h="16838"/>

</xml_diff>